<commit_message>
Study guide: tile and Part 2 rows aligned (exact row heights), add red vs violet photon question
Co-Authored-By: Claude Opus 5.5 <noreply@anthropic.com>
Claude-Session: https://claude.ai/code/session_01LaT1EarAMnh5opQoFahNzN
</commit_message>
<xml_diff>
--- a/output/chem-u02/Unit 2 Study Guide Key.docx
+++ b/output/chem-u02/Unit 2 Study Guide Key.docx
@@ -1430,7 +1430,7 @@
       <w:tr>
         <w:trPr>
           <w:cantSplit/>
-          <w:trHeight w:val="489" w:hRule="atLeast"/>
+          <w:trHeight w:val="432" w:hRule="exact"/>
         </w:trPr>
         <w:tc>
           <w:tcPr>
@@ -1465,7 +1465,7 @@
           <w:tcPr>
             <w:tcW w:type="dxa" w:w="1440"/>
             <w:vMerge w:val="restart"/>
-            <w:vAlign w:val="top"/>
+            <w:vAlign w:val="center"/>
             <w:tcMar>
               <w:top w:w="0" w:type="dxa"/>
               <w:left w:w="0" w:type="dxa"/>
@@ -1830,7 +1830,7 @@
       <w:tr>
         <w:trPr>
           <w:cantSplit/>
-          <w:trHeight w:val="86" w:hRule="atLeast"/>
+          <w:trHeight w:val="57" w:hRule="exact"/>
         </w:trPr>
         <w:tc>
           <w:tcPr>
@@ -1874,7 +1874,7 @@
       <w:tr>
         <w:trPr>
           <w:cantSplit/>
-          <w:trHeight w:val="691" w:hRule="atLeast"/>
+          <w:trHeight w:val="835" w:hRule="exact"/>
         </w:trPr>
         <w:tc>
           <w:tcPr>
@@ -2797,7 +2797,7 @@
       <w:tr>
         <w:trPr>
           <w:cantSplit/>
-          <w:trHeight w:val="489" w:hRule="atLeast"/>
+          <w:trHeight w:val="432" w:hRule="exact"/>
         </w:trPr>
         <w:tc>
           <w:tcPr>
@@ -2832,7 +2832,7 @@
           <w:tcPr>
             <w:tcW w:type="dxa" w:w="1440"/>
             <w:vMerge w:val="restart"/>
-            <w:vAlign w:val="top"/>
+            <w:vAlign w:val="center"/>
             <w:tcMar>
               <w:top w:w="0" w:type="dxa"/>
               <w:left w:w="0" w:type="dxa"/>
@@ -3113,7 +3113,7 @@
       <w:tr>
         <w:trPr>
           <w:cantSplit/>
-          <w:trHeight w:val="86" w:hRule="atLeast"/>
+          <w:trHeight w:val="57" w:hRule="exact"/>
         </w:trPr>
         <w:tc>
           <w:tcPr>
@@ -3157,7 +3157,7 @@
       <w:tr>
         <w:trPr>
           <w:cantSplit/>
-          <w:trHeight w:val="691" w:hRule="atLeast"/>
+          <w:trHeight w:val="835" w:hRule="exact"/>
         </w:trPr>
         <w:tc>
           <w:tcPr>
@@ -6803,6 +6803,110 @@
         </w:tc>
       </w:tr>
     </w:tbl>
+    <w:tbl>
+      <w:tblPr>
+        <w:tblW w:type="auto" w:w="0"/>
+        <w:jc w:val="left"/>
+        <w:tblLayout w:type="fixed"/>
+        <w:tblLook w:firstColumn="1" w:firstRow="1" w:lastColumn="0" w:lastRow="0" w:noHBand="0" w:noVBand="1" w:val="04A0"/>
+        <w:tblLayout w:type="fixed"/>
+      </w:tblPr>
+      <w:tblGrid>
+        <w:gridCol w:w="10800"/>
+      </w:tblGrid>
+      <w:tr>
+        <w:tc>
+          <w:tcPr>
+            <w:tcW w:type="dxa" w:w="10800"/>
+            <w:tcBorders>
+              <w:bottom w:val="single" w:sz="4" w:color="C8CDC2"/>
+            </w:tcBorders>
+            <w:tcMar>
+              <w:top w:w="30" w:type="dxa"/>
+              <w:left w:w="40" w:type="dxa"/>
+              <w:bottom w:w="30" w:type="dxa"/>
+              <w:right w:w="40" w:type="dxa"/>
+            </w:tcMar>
+          </w:tcPr>
+          <w:p>
+            <w:pPr>
+              <w:spacing w:after="20"/>
+              <w:ind w:left="360" w:hanging="360"/>
+            </w:pPr>
+            <w:r>
+              <w:rPr>
+                <w:rFonts w:ascii="Trade Gothic Next" w:hAnsi="Trade Gothic Next"/>
+                <w:b/>
+                <w:color w:val="4D730E"/>
+                <w:sz w:val="20"/>
+                <w:u w:val="none"/>
+              </w:rPr>
+              <w:t xml:space="preserve">15   </w:t>
+            </w:r>
+            <w:r>
+              <w:rPr>
+                <w:rFonts w:ascii="Trade Gothic Next" w:hAnsi="Trade Gothic Next"/>
+                <w:b w:val="0"/>
+                <w:color w:val="14161B"/>
+                <w:sz w:val="20"/>
+                <w:u w:val="none"/>
+              </w:rPr>
+              <w:t>One drop gives off red light and another gives off violet light. Which drop was bigger? How do you know?</w:t>
+            </w:r>
+          </w:p>
+          <w:tbl>
+            <w:tblPr>
+              <w:tblW w:type="auto" w:w="0"/>
+              <w:tblLayout w:type="fixed"/>
+              <w:tblLook w:firstColumn="1" w:firstRow="1" w:lastColumn="0" w:lastRow="0" w:noHBand="0" w:noVBand="1" w:val="04A0"/>
+              <w:tblLayout w:type="fixed"/>
+            </w:tblPr>
+            <w:tblGrid>
+              <w:gridCol w:w="10152"/>
+            </w:tblGrid>
+            <w:tr>
+              <w:trPr>
+                <w:cantSplit/>
+                <w:trHeight w:val="460" w:hRule="atLeast"/>
+              </w:trPr>
+              <w:tc>
+                <w:tcPr>
+                  <w:tcW w:type="dxa" w:w="10152"/>
+                  <w:vAlign w:val="bottom"/>
+                  <w:tcBorders>
+                    <w:bottom w:val="single" w:sz="6" w:color="C8CDC2"/>
+                  </w:tcBorders>
+                  <w:tcMar>
+                    <w:top w:w="0" w:type="dxa"/>
+                    <w:left w:w="60" w:type="dxa"/>
+                    <w:bottom w:w="10" w:type="dxa"/>
+                    <w:right w:w="0" w:type="dxa"/>
+                  </w:tcMar>
+                </w:tcPr>
+                <w:p>
+                  <w:pPr>
+                    <w:spacing w:after="0"/>
+                  </w:pPr>
+                  <w:r>
+                    <w:rPr>
+                      <w:rFonts w:ascii="ShullHand" w:hAnsi="ShullHand"/>
+                      <w:color w:val="4A2466"/>
+                      <w:sz w:val="24"/>
+                    </w:rPr>
+                    <w:t>Violet. It has a shorter wavelength, so more energy and a bigger drop.</w:t>
+                  </w:r>
+                </w:p>
+              </w:tc>
+            </w:tr>
+          </w:tbl>
+          <w:p>
+            <w:pPr>
+              <w:spacing w:before="0" w:after="0" w:line="20" w:lineRule="exact"/>
+            </w:pPr>
+          </w:p>
+        </w:tc>
+      </w:tr>
+    </w:tbl>
     <w:p>
       <w:pPr>
         <w:spacing w:before="0" w:after="0" w:line="60" w:lineRule="exact"/>
@@ -6849,7 +6953,7 @@
                 <w:sz w:val="20"/>
                 <w:u w:val="none"/>
               </w:rPr>
-              <w:t xml:space="preserve">15   </w:t>
+              <w:t xml:space="preserve">16   </w:t>
             </w:r>
             <w:r>
               <w:rPr>
@@ -7283,7 +7387,7 @@
                 <w:sz w:val="20"/>
                 <w:u w:val="none"/>
               </w:rPr>
-              <w:t xml:space="preserve">16   </w:t>
+              <w:t xml:space="preserve">17   </w:t>
             </w:r>
             <w:r>
               <w:rPr>

</xml_diff>